<commit_message>
Avisa fallas de API en Telegram
</commit_message>
<xml_diff>
--- a/docs/02_Guia_del_docente_y_rubrica.docx
+++ b/docs/02_Guia_del_docente_y_rubrica.docx
@@ -5066,7 +5066,7 @@
         <w:t xml:space="preserve">pruebas.yml</w:t>
       </w:r>
       <w:r>
-        <w:t xml:space="preserve"> corre 24 pruebas en simulación en cada subida, sin llaves. Es una buena forma de introducir la idea de integración continua.</w:t>
+        <w:t xml:space="preserve"> corre 25 pruebas en simulación en cada subida, sin llaves. Es una buena forma de introducir la idea de integración continua.</w:t>
       </w:r>
     </w:p>
     <w:p>
@@ -5187,7 +5187,7 @@
         <w:spacing w:after="60"/>
       </w:pPr>
       <w:r>
-        <w:t>24 pruebas automáticas aprobadas en modo simulación, incluida la simulación de una corrida de GitHub Actions con 4 mensajes pendientes y de una copia sin Secrets.</w:t>
+        <w:t>25 pruebas automáticas aprobadas en modo simulación, incluida la simulación de una corrida de GitHub Actions con 4 mensajes pendientes y de una copia sin Secrets.</w:t>
       </w:r>
     </w:p>
     <w:p>

</xml_diff>